<commit_message>
Incluir exercício de revisão para AV01
</commit_message>
<xml_diff>
--- a/exercicios/ProjetoDockerServidorWEB.docx
+++ b/exercicios/ProjetoDockerServidorWEB.docx
@@ -291,15 +291,7 @@
           <w:i/>
           <w:iCs/>
         </w:rPr>
-        <w:t xml:space="preserve">OBS: </w:t>
-      </w:r>
-      <w:r>
-        <w:rPr>
-          <w:rFonts w:ascii="Aptos" w:hAnsi="Aptos"/>
-          <w:i/>
-          <w:iCs/>
-        </w:rPr>
-        <w:t xml:space="preserve">Se a imagem </w:t>
+        <w:t xml:space="preserve">OBS: Se a imagem </w:t>
       </w:r>
       <w:proofErr w:type="spellStart"/>
       <w:r>
@@ -596,32 +588,24 @@
           <w:i/>
           <w:iCs/>
         </w:rPr>
-        <w:t xml:space="preserve">OBS: </w:t>
-      </w:r>
+        <w:t xml:space="preserve">OBS: Este comando lista todos os contêineres que estão em execução. Você deverá ver uma linha com o nome meu-servidor-web e o status </w:t>
+      </w:r>
+      <w:proofErr w:type="spellStart"/>
       <w:r>
         <w:rPr>
           <w:rFonts w:ascii="Aptos" w:hAnsi="Aptos"/>
           <w:i/>
           <w:iCs/>
         </w:rPr>
-        <w:t xml:space="preserve">Este comando lista todos os contêineres que estão em execução. Você deverá ver uma linha com o nome meu-servidor-web e o status </w:t>
-      </w:r>
-      <w:proofErr w:type="spellStart"/>
+        <w:t>Up</w:t>
+      </w:r>
+      <w:proofErr w:type="spellEnd"/>
       <w:r>
         <w:rPr>
           <w:rFonts w:ascii="Aptos" w:hAnsi="Aptos"/>
           <w:i/>
           <w:iCs/>
         </w:rPr>
-        <w:t>Up</w:t>
-      </w:r>
-      <w:proofErr w:type="spellEnd"/>
-      <w:r>
-        <w:rPr>
-          <w:rFonts w:ascii="Aptos" w:hAnsi="Aptos"/>
-          <w:i/>
-          <w:iCs/>
-        </w:rPr>
         <w:t xml:space="preserve"> (ativo).</w:t>
       </w:r>
     </w:p>
@@ -718,31 +702,7 @@
           <w:bCs/>
         </w:rPr>
         <w:lastRenderedPageBreak/>
-        <w:t xml:space="preserve">Passo </w:t>
-      </w:r>
-      <w:r>
-        <w:rPr>
-          <w:rFonts w:ascii="Aptos" w:hAnsi="Aptos"/>
-          <w:b/>
-          <w:bCs/>
-        </w:rPr>
-        <w:t>5</w:t>
-      </w:r>
-      <w:r>
-        <w:rPr>
-          <w:rFonts w:ascii="Aptos" w:hAnsi="Aptos"/>
-          <w:b/>
-          <w:bCs/>
-        </w:rPr>
-        <w:t xml:space="preserve">: </w:t>
-      </w:r>
-      <w:r>
-        <w:rPr>
-          <w:rFonts w:ascii="Aptos" w:hAnsi="Aptos"/>
-          <w:b/>
-          <w:bCs/>
-        </w:rPr>
-        <w:t xml:space="preserve">Copiar arquivos do projeto local para a pasta </w:t>
+        <w:t xml:space="preserve">Passo 5: Copiar arquivos do projeto local para a pasta </w:t>
       </w:r>
       <w:proofErr w:type="spellStart"/>
       <w:r>
@@ -947,6 +907,7 @@
         <w:t xml:space="preserve"> </w:t>
       </w:r>
       <w:proofErr w:type="spellStart"/>
+      <w:proofErr w:type="gramStart"/>
       <w:r>
         <w:rPr>
           <w:rFonts w:ascii="Aptos" w:hAnsi="Aptos"/>
@@ -962,6 +923,7 @@
         </w:rPr>
         <w:t xml:space="preserve"> .</w:t>
       </w:r>
+      <w:proofErr w:type="gramEnd"/>
       <w:r>
         <w:rPr>
           <w:rFonts w:ascii="Aptos" w:hAnsi="Aptos"/>
@@ -973,13 +935,7 @@
         <w:rPr>
           <w:rFonts w:ascii="Aptos" w:hAnsi="Aptos"/>
         </w:rPr>
-        <w:t xml:space="preserve"> </w:t>
-      </w:r>
-      <w:r>
-        <w:rPr>
-          <w:rFonts w:ascii="Aptos" w:hAnsi="Aptos"/>
-        </w:rPr>
-        <w:t>calculadora_completa.html</w:t>
+        <w:t xml:space="preserve"> calculadora_completa.html</w:t>
       </w:r>
       <w:r>
         <w:rPr>
@@ -1042,6 +998,7 @@
         </w:rPr>
         <w:t xml:space="preserve">Teste chamando o </w:t>
       </w:r>
+      <w:proofErr w:type="gramStart"/>
       <w:r>
         <w:rPr>
           <w:rFonts w:ascii="Aptos" w:hAnsi="Aptos"/>
@@ -1053,19 +1010,14 @@
         <w:rPr>
           <w:rFonts w:ascii="Aptos" w:hAnsi="Aptos"/>
         </w:rPr>
-        <w:t>/</w:t>
-      </w:r>
-      <w:r>
-        <w:rPr>
-          <w:rFonts w:ascii="Aptos" w:hAnsi="Aptos"/>
-        </w:rPr>
-        <w:t>calculadora_completa.html</w:t>
-      </w:r>
-      <w:r>
-        <w:rPr>
-          <w:rFonts w:ascii="Aptos" w:hAnsi="Aptos"/>
-        </w:rPr>
-        <w:t xml:space="preserve"> . Agora a pagina da calculadora está dentro do serviço web do container</w:t>
+        <w:t>/calculadora_completa.html .</w:t>
+      </w:r>
+      <w:proofErr w:type="gramEnd"/>
+      <w:r>
+        <w:rPr>
+          <w:rFonts w:ascii="Aptos" w:hAnsi="Aptos"/>
+        </w:rPr>
+        <w:t xml:space="preserve"> Agora a pagina da calculadora está dentro do serviço web do container</w:t>
       </w:r>
     </w:p>
     <w:p>
@@ -1256,7 +1208,7 @@
           <w:rFonts w:ascii="Aptos" w:hAnsi="Aptos"/>
           <w:highlight w:val="lightGray"/>
         </w:rPr>
-        <w:t>enabled</w:t>
+        <w:t>available</w:t>
       </w:r>
       <w:proofErr w:type="spellEnd"/>
       <w:r>
@@ -1266,6 +1218,7 @@
         </w:rPr>
         <w:t xml:space="preserve">/default </w:t>
       </w:r>
+      <w:proofErr w:type="gramStart"/>
       <w:r>
         <w:rPr>
           <w:rFonts w:ascii="Aptos" w:hAnsi="Aptos"/>
@@ -1282,6 +1235,7 @@
         </w:rPr>
         <w:t>.</w:t>
       </w:r>
+      <w:proofErr w:type="gramEnd"/>
       <w:r>
         <w:rPr>
           <w:rFonts w:ascii="Aptos" w:hAnsi="Aptos"/>
@@ -1354,6 +1308,7 @@
           <w:rFonts w:ascii="Aptos" w:hAnsi="Aptos"/>
         </w:rPr>
       </w:pPr>
+      <w:proofErr w:type="gramStart"/>
       <w:r>
         <w:rPr>
           <w:rFonts w:ascii="Aptos" w:hAnsi="Aptos"/>
@@ -1368,7 +1323,15 @@
           <w:rFonts w:ascii="Aptos" w:hAnsi="Aptos"/>
           <w:highlight w:val="lightGray"/>
         </w:rPr>
-        <w:t xml:space="preserve">  calculadora_completa.html;</w:t>
+        <w:t xml:space="preserve">  calculadora_completa.html</w:t>
+      </w:r>
+      <w:proofErr w:type="gramEnd"/>
+      <w:r>
+        <w:rPr>
+          <w:rFonts w:ascii="Aptos" w:hAnsi="Aptos"/>
+          <w:highlight w:val="lightGray"/>
+        </w:rPr>
+        <w:t>;</w:t>
       </w:r>
     </w:p>
     <w:p>
@@ -1406,37 +1369,41 @@
           <w:rFonts w:ascii="Aptos" w:hAnsi="Aptos"/>
           <w:highlight w:val="lightGray"/>
         </w:rPr>
-        <w:t xml:space="preserve">   </w:t>
-      </w:r>
-      <w:r>
-        <w:rPr>
-          <w:rFonts w:ascii="Aptos" w:hAnsi="Aptos"/>
-          <w:b/>
-          <w:bCs/>
-          <w:highlight w:val="lightGray"/>
-        </w:rPr>
-        <w:t>.\</w:t>
-      </w:r>
-      <w:r>
-        <w:rPr>
-          <w:rFonts w:ascii="Aptos" w:hAnsi="Aptos"/>
-          <w:highlight w:val="lightGray"/>
-        </w:rPr>
         <w:t xml:space="preserve"> </w:t>
       </w:r>
-      <w:r>
-        <w:rPr>
-          <w:rFonts w:ascii="Aptos" w:hAnsi="Aptos"/>
-          <w:highlight w:val="lightGray"/>
-        </w:rPr>
-        <w:t>default</w:t>
-      </w:r>
-      <w:r>
-        <w:rPr>
-          <w:rFonts w:ascii="Aptos" w:hAnsi="Aptos"/>
-          <w:highlight w:val="lightGray"/>
-        </w:rPr>
-        <w:t xml:space="preserve"> </w:t>
+      <w:proofErr w:type="gramStart"/>
+      <w:r>
+        <w:rPr>
+          <w:rFonts w:ascii="Aptos" w:hAnsi="Aptos"/>
+          <w:highlight w:val="lightGray"/>
+        </w:rPr>
+        <w:t xml:space="preserve">  </w:t>
+      </w:r>
+      <w:r>
+        <w:rPr>
+          <w:rFonts w:ascii="Aptos" w:hAnsi="Aptos"/>
+          <w:b/>
+          <w:bCs/>
+          <w:highlight w:val="lightGray"/>
+        </w:rPr>
+        <w:t>.</w:t>
+      </w:r>
+      <w:proofErr w:type="gramEnd"/>
+      <w:r>
+        <w:rPr>
+          <w:rFonts w:ascii="Aptos" w:hAnsi="Aptos"/>
+          <w:b/>
+          <w:bCs/>
+          <w:highlight w:val="lightGray"/>
+        </w:rPr>
+        <w:t>\</w:t>
+      </w:r>
+      <w:r>
+        <w:rPr>
+          <w:rFonts w:ascii="Aptos" w:hAnsi="Aptos"/>
+          <w:highlight w:val="lightGray"/>
+        </w:rPr>
+        <w:t xml:space="preserve"> default </w:t>
       </w:r>
       <w:r>
         <w:rPr>
@@ -1993,12 +1960,14 @@
               <w:t>nome_da_imagem</w:t>
             </w:r>
             <w:proofErr w:type="spellEnd"/>
+            <w:proofErr w:type="gramStart"/>
             <w:r>
               <w:rPr>
                 <w:rFonts w:ascii="Aptos" w:hAnsi="Aptos"/>
               </w:rPr>
               <w:t>] .</w:t>
             </w:r>
+            <w:proofErr w:type="gramEnd"/>
           </w:p>
         </w:tc>
         <w:tc>
@@ -2057,7 +2026,21 @@
               <w:rPr>
                 <w:rFonts w:ascii="Aptos" w:hAnsi="Aptos"/>
               </w:rPr>
-              <w:t>) nomeia a imagem, e o . indica o diretório atual como contexto.</w:t>
+              <w:t xml:space="preserve">) nomeia a imagem, e </w:t>
+            </w:r>
+            <w:proofErr w:type="gramStart"/>
+            <w:r>
+              <w:rPr>
+                <w:rFonts w:ascii="Aptos" w:hAnsi="Aptos"/>
+              </w:rPr>
+              <w:t>o .</w:t>
+            </w:r>
+            <w:proofErr w:type="gramEnd"/>
+            <w:r>
+              <w:rPr>
+                <w:rFonts w:ascii="Aptos" w:hAnsi="Aptos"/>
+              </w:rPr>
+              <w:t xml:space="preserve"> indica o diretório atual como contexto.</w:t>
             </w:r>
           </w:p>
         </w:tc>
@@ -4490,6 +4473,7 @@
   <w:style w:type="character" w:default="1" w:styleId="Fontepargpadro">
     <w:name w:val="Default Paragraph Font"/>
     <w:uiPriority w:val="1"/>
+    <w:semiHidden/>
     <w:unhideWhenUsed/>
   </w:style>
   <w:style w:type="table" w:default="1" w:styleId="Tabelanormal">

</xml_diff>